<commit_message>
Add Yahoo Finance data-source reference to A3
The share-price figure cites Yahoo Finance but it was missing from the
reference list. Add the APA 7 data-set entry to 26254793_A3.docx and to
build_docx.py (single source of truth), and make build_docx.py path
machine-independent.

Co-Authored-By: Claude Opus 4.8 <noreply@anthropic.com>
</commit_message>
<xml_diff>
--- a/Foundation Studio/Assessment3/26254793_A3.docx
+++ b/Foundation Studio/Assessment3/26254793_A3.docx
@@ -1033,6 +1033,31 @@
         </w:r>
       </w:hyperlink>
     </w:p>
+    <w:p>
+      <w:pPr>
+        <w:spacing w:line="360" w:lineRule="auto" w:after="80"/>
+        <w:ind w:left="425" w:hanging="425"/>
+        <w:jc w:val="left"/>
+      </w:pPr>
+      <w:r>
+        <w:rPr>
+          <w:rFonts w:ascii="Microsoft JhengHei" w:hAnsi="Microsoft JhengHei" w:eastAsia="Microsoft JhengHei" w:cs="Microsoft JhengHei"/>
+          <w:sz w:val="24"/>
+        </w:rPr>
+        <w:t xml:space="preserve">Yahoo Finance. (2026). nib Holdings Limited (NHF.AX) and S&amp;P/ASX 200 (^AXJO) historical prices [Data set]. </w:t>
+      </w:r>
+      <w:hyperlink r:id="rId23">
+        <w:r>
+          <w:rPr>
+            <w:rFonts w:ascii="Microsoft JhengHei" w:hAnsi="Microsoft JhengHei" w:eastAsia="Microsoft JhengHei" w:cs="Microsoft JhengHei"/>
+            <w:sz w:val="24"/>
+            <w:color w:val="0563C1"/>
+            <w:u w:val="single"/>
+          </w:rPr>
+          <w:t xml:space="preserve">https://finance.yahoo.com</w:t>
+        </w:r>
+      </w:hyperlink>
+    </w:p>
     <w:sectPr>
       <w:pgSz w:w="11906" w:h="16838"/>
       <w:pgMar w:top="1417" w:right="1417" w:bottom="1417" w:left="1417" w:header="720" w:footer="720" w:gutter="0"/>

</xml_diff>